<commit_message>
Gearing and debt recycling cite both heads (s25-5 & s8-1) with TD 2024/7 para 28 caution
Consistent with the exemplars citing both heads for existing-investment
advice: managing deductible investment debt is s8-1, the interest-deductibility
and debt-structure analysis is s25-5. Guidance now warns that advice
recommending NEW borrowings into NEW investments is capital under TD 2024/7
para 28 and belongs on the Establish New Portfolio row; this row covers
managing/refinancing existing investment debt. 70-100% range and 70/85/100
presets unchanged. Basis phrase updated; spec regenerated.

Co-Authored-By: Claude Fable 5 <noreply@anthropic.com>
Claude-Session: https://claude.ai/code/session_01NJs6mi8LNhWUL2Cmf4Liqz
</commit_message>
<xml_diff>
--- a/MWS_Fee_Apportioning_Rules_Spec.docx
+++ b/MWS_Fee_Apportioning_Rules_Spec.docx
@@ -2854,7 +2854,7 @@
                 <w:szCs w:val="18"/>
                 <w:rFonts w:ascii="Nunito Sans" w:cs="Nunito Sans" w:eastAsia="Nunito Sans" w:hAnsi="Nunito Sans"/>
               </w:rPr>
-              <w:t xml:space="preserve">s8-1</w:t>
+              <w:t xml:space="preserve">s25-5 &amp; s8-1</w:t>
             </w:r>
           </w:p>
         </w:tc>
@@ -5046,7 +5046,7 @@
                 <w:szCs w:val="18"/>
                 <w:rFonts w:ascii="Nunito Sans" w:cs="Nunito Sans" w:eastAsia="Nunito Sans" w:hAnsi="Nunito Sans"/>
               </w:rPr>
-              <w:t xml:space="preserve">s8-1</w:t>
+              <w:t xml:space="preserve">s25-5 &amp; s8-1</w:t>
             </w:r>
           </w:p>
         </w:tc>
@@ -7729,7 +7729,7 @@
                 <w:szCs w:val="18"/>
                 <w:rFonts w:ascii="Nunito Sans" w:cs="Nunito Sans" w:eastAsia="Nunito Sans" w:hAnsi="Nunito Sans"/>
               </w:rPr>
-              <w:t xml:space="preserve">70–100% · s8-1</w:t>
+              <w:t xml:space="preserve">70–100% · s25-5 &amp; s8-1</w:t>
             </w:r>
           </w:p>
         </w:tc>
@@ -8417,7 +8417,7 @@
                 <w:szCs w:val="18"/>
                 <w:rFonts w:ascii="Nunito Sans" w:cs="Nunito Sans" w:eastAsia="Nunito Sans" w:hAnsi="Nunito Sans"/>
               </w:rPr>
-              <w:t xml:space="preserve">70–100% · s8-1</w:t>
+              <w:t xml:space="preserve">70–100% · s25-5 &amp; s8-1</w:t>
             </w:r>
           </w:p>
         </w:tc>
@@ -13460,7 +13460,7 @@
           <w:szCs w:val="19"/>
           <w:rFonts w:ascii="Nunito Sans" w:cs="Nunito Sans" w:eastAsia="Nunito Sans" w:hAnsi="Nunito Sans"/>
         </w:rPr>
-        <w:t xml:space="preserve">s8-1</w:t>
+        <w:t xml:space="preserve">s25-5 &amp; s8-1</w:t>
       </w:r>
     </w:p>
     <w:p>
@@ -13522,7 +13522,7 @@
           <w:szCs w:val="19"/>
           <w:rFonts w:ascii="Nunito Sans" w:cs="Nunito Sans" w:eastAsia="Nunito Sans" w:hAnsi="Nunito Sans"/>
         </w:rPr>
-        <w:t xml:space="preserve">“Advice on managing a deductible investment loan (Gearing) (s8-1)”</w:t>
+        <w:t xml:space="preserve">“Advice on managing deductible investment borrowings, including interest deductibility and the tax implications of the debt structure (s8-1 and s25-5)”</w:t>
       </w:r>
     </w:p>
     <w:p>
@@ -13584,7 +13584,7 @@
           <w:szCs w:val="19"/>
           <w:rFonts w:ascii="Nunito Sans" w:cs="Nunito Sans" w:eastAsia="Nunito Sans" w:hAnsi="Nunito Sans"/>
         </w:rPr>
-        <w:t xml:space="preserve">House treatment is 70-100% — the advice manages deductible investment debt and its interest deductibility (s8-1 nexus to the investment income). Use the lower end where the work includes private/home-loan elements; 100 only where the engagement is wholly investment-debt structuring with documented purpose tracing.</w:t>
+        <w:t xml:space="preserve">House treatment is 70-100% — the advice manages deductible investment debt (s8-1 nexus to the investment income) and includes interest-deductibility and debt-structure tax analysis (s25-5), consistent with the exemplars citing both heads for existing-investment advice. CAUTION (TD 2024/7 para 28): advice recommending NEW borrowings to make NEW investments is capital and not deductible under s8-1 — record that component on the Establish a New Investment Portfolio row (0%) and keep this row for managing/refinancing EXISTING investment debt. Use the lower end where the work includes private/home-loan elements; 100 only where the engagement is wholly existing-investment-debt structuring with documented purpose tracing.</w:t>
       </w:r>
     </w:p>
     <w:p>
@@ -13615,7 +13615,7 @@
           <w:szCs w:val="19"/>
           <w:rFonts w:ascii="Nunito Sans" w:cs="Nunito Sans" w:eastAsia="Nunito Sans" w:hAnsi="Nunito Sans"/>
         </w:rPr>
-        <w:t xml:space="preserve">Structuring and managing deductible investment debt (property/share loans, refinancing) has an s8-1 nexus to the assessable income the borrowings produce; private debt elements are apportioned out.</w:t>
+        <w:t xml:space="preserve">Managing deductible investment borrowings (property/share loans, refinancing) has an s8-1 nexus to the assessable income the borrowings produce, and the interest-deductibility/debt-structure analysis is tax-affairs advice (s25-5). Establishment of new borrowings for new investments is capital (TD 2024/7 para 28) and sits outside this row.</w:t>
       </w:r>
     </w:p>
     <w:p>
@@ -17722,7 +17722,7 @@
           <w:szCs w:val="19"/>
           <w:rFonts w:ascii="Nunito Sans" w:cs="Nunito Sans" w:eastAsia="Nunito Sans" w:hAnsi="Nunito Sans"/>
         </w:rPr>
-        <w:t xml:space="preserve">s8-1</w:t>
+        <w:t xml:space="preserve">s25-5 &amp; s8-1</w:t>
       </w:r>
     </w:p>
     <w:p>
@@ -17784,7 +17784,7 @@
           <w:szCs w:val="19"/>
           <w:rFonts w:ascii="Nunito Sans" w:cs="Nunito Sans" w:eastAsia="Nunito Sans" w:hAnsi="Nunito Sans"/>
         </w:rPr>
-        <w:t xml:space="preserve">“Advice on managing a deductible investment loan (Gearing) (s8-1)”</w:t>
+        <w:t xml:space="preserve">“Advice on managing deductible investment borrowings, including interest deductibility and the tax implications of the debt structure (s8-1 and s25-5)”</w:t>
       </w:r>
     </w:p>
     <w:p>
@@ -17846,7 +17846,7 @@
           <w:szCs w:val="19"/>
           <w:rFonts w:ascii="Nunito Sans" w:cs="Nunito Sans" w:eastAsia="Nunito Sans" w:hAnsi="Nunito Sans"/>
         </w:rPr>
-        <w:t xml:space="preserve">House treatment is 70-100% — the advice structures deductible investment debt and its interest deductibility. Use the lower end where the work is substantially home-loan management; 100 only where the engagement is wholly investment-debt structuring with documented tracing.</w:t>
+        <w:t xml:space="preserve">House treatment is 70-100% — the advice structures deductible investment debt (s8-1) with borrowing-purpose tracing and interest-deductibility analysis (s25-5). CAUTION (TD 2024/7 para 28): where the recycling recommends NEW borrowings deployed into NEW investments, that establishment component is capital — record it on the Establish a New Investment Portfolio row and keep this row for the debt-structure and deductibility work. Use the lower end where the work is substantially home-loan management; 100 only where wholly investment-debt structuring with documented tracing.</w:t>
       </w:r>
     </w:p>
     <w:p>
@@ -17877,7 +17877,7 @@
           <w:szCs w:val="19"/>
           <w:rFonts w:ascii="Nunito Sans" w:cs="Nunito Sans" w:eastAsia="Nunito Sans" w:hAnsi="Nunito Sans"/>
         </w:rPr>
-        <w:t xml:space="preserve">Mixed private debt restructuring and tax/investment borrowing advice. Deductible component depends on clear s8-1 nexus and tax-affairs analysis.</w:t>
+        <w:t xml:space="preserve">Converting private debt into deductible investment debt involves managing income-producing borrowings (s8-1) and the tax analysis of borrowing purpose and interest deductibility (s25-5). New-investment establishment components are capital (TD 2024/7 para 28) and are apportioned out.</w:t>
       </w:r>
     </w:p>
     <w:p>

</xml_diff>